<commit_message>
Documento de Plan Pruebas
</commit_message>
<xml_diff>
--- a/Desarrollo/Sistema de Control de Peso (SISCOP)/Diseño/SISCOP-PS.docx
+++ b/Desarrollo/Sistema de Control de Peso (SISCOP)/Diseño/SISCOP-PS.docx
@@ -66,12 +66,12 @@
           <wp:inline distB="114300" distT="114300" distL="114300" distR="114300">
             <wp:extent cx="447675" cy="57150"/>
             <wp:effectExtent b="0" l="0" r="0" t="0"/>
-            <wp:docPr descr="línea corta" id="3" name="image1.png"/>
+            <wp:docPr descr="línea corta" id="3" name="image2.png"/>
             <a:graphic>
               <a:graphicData uri="http://schemas.openxmlformats.org/drawingml/2006/picture">
                 <pic:pic>
                   <pic:nvPicPr>
-                    <pic:cNvPr descr="línea corta" id="0" name="image1.png"/>
+                    <pic:cNvPr descr="línea corta" id="0" name="image2.png"/>
                     <pic:cNvPicPr preferRelativeResize="0"/>
                   </pic:nvPicPr>
                   <pic:blipFill>
@@ -156,7 +156,7 @@
           <w:szCs w:val="32"/>
           <w:rtl w:val="0"/>
         </w:rPr>
-        <w:t xml:space="preserve">Ccahuana Quiñonez Judith </w:t>
+        <w:t xml:space="preserve">Ccahuana Quiñones Judith </w:t>
       </w:r>
     </w:p>
     <w:p>
@@ -1240,7 +1240,7 @@
     </w:p>
     <w:sdt>
       <w:sdtPr>
-        <w:id w:val="942113267"/>
+        <w:id w:val="-1638751980"/>
         <w:docPartObj>
           <w:docPartGallery w:val="Table of Contents"/>
           <w:docPartUnique w:val="1"/>
@@ -8056,7 +8056,7 @@
                 <w:color w:val="222222"/>
                 <w:rtl w:val="0"/>
               </w:rPr>
-              <w:t xml:space="preserve">Verificar que el sistema no permita registrar pacientes con campos obligatorios vacíos</w:t>
+              <w:t xml:space="preserve">Verificar que el sistema no permite registrar pacientes con campos obligatorios vacíos</w:t>
             </w:r>
           </w:p>
         </w:tc>
@@ -8897,7 +8897,7 @@
                 <w:color w:val="222222"/>
                 <w:rtl w:val="0"/>
               </w:rPr>
-              <w:t xml:space="preserve">Verificar que el sistema permita consultar pacientes mediante DNI</w:t>
+              <w:t xml:space="preserve">Verificar que el sistema permite consultar pacientes mediante DNI</w:t>
             </w:r>
           </w:p>
         </w:tc>
@@ -12707,7 +12707,7 @@
                 <w:color w:val="222222"/>
                 <w:rtl w:val="0"/>
               </w:rPr>
-              <w:t xml:space="preserve">Verificar que el sistema no permita guardar cambios con campos vacíos</w:t>
+              <w:t xml:space="preserve">Verificar que el sistema no permite guardar cambios con campos vacíos</w:t>
             </w:r>
           </w:p>
         </w:tc>
@@ -13512,7 +13512,7 @@
                 <w:color w:val="222222"/>
                 <w:rtl w:val="0"/>
               </w:rPr>
-              <w:t xml:space="preserve">Verificar que el sistema permita buscar una historia clínica mediante DNI</w:t>
+              <w:t xml:space="preserve">Verificar que el sistema permite buscar una historia clínica mediante DNI</w:t>
             </w:r>
           </w:p>
         </w:tc>
@@ -14260,7 +14260,7 @@
                 <w:color w:val="222222"/>
                 <w:rtl w:val="0"/>
               </w:rPr>
-              <w:t xml:space="preserve">Verificar que el sistema permita buscar una historia clínica mediante nombre</w:t>
+              <w:t xml:space="preserve">Verificar que el sistema permite buscar una historia clínica mediante nombre</w:t>
             </w:r>
           </w:p>
         </w:tc>
@@ -25519,12 +25519,12 @@
           <wp:extent cx="7781925" cy="409575"/>
           <wp:effectExtent b="0" l="0" r="0" t="0"/>
           <wp:wrapNone/>
-          <wp:docPr descr="pie de página" id="1" name="image2.png"/>
+          <wp:docPr descr="pie de página" id="1" name="image1.png"/>
           <a:graphic>
             <a:graphicData uri="http://schemas.openxmlformats.org/drawingml/2006/picture">
               <pic:pic>
                 <pic:nvPicPr>
-                  <pic:cNvPr descr="pie de página" id="0" name="image2.png"/>
+                  <pic:cNvPr descr="pie de página" id="0" name="image1.png"/>
                   <pic:cNvPicPr preferRelativeResize="0"/>
                 </pic:nvPicPr>
                 <pic:blipFill>
@@ -25576,12 +25576,12 @@
           <wp:extent cx="8801100" cy="223838"/>
           <wp:effectExtent b="0" l="0" r="0" t="0"/>
           <wp:wrapNone/>
-          <wp:docPr descr="línea horizontal" id="2" name="image2.png"/>
+          <wp:docPr descr="línea horizontal" id="2" name="image1.png"/>
           <a:graphic>
             <a:graphicData uri="http://schemas.openxmlformats.org/drawingml/2006/picture">
               <pic:pic>
                 <pic:nvPicPr>
-                  <pic:cNvPr descr="línea horizontal" id="0" name="image2.png"/>
+                  <pic:cNvPr descr="línea horizontal" id="0" name="image1.png"/>
                   <pic:cNvPicPr preferRelativeResize="0"/>
                 </pic:nvPicPr>
                 <pic:blipFill>

</xml_diff>